<commit_message>
Push project lengkap untuk deploy Vercel
</commit_message>
<xml_diff>
--- a/APLIKASI SIGESIT SANDAS PKM PADASUKA.docx
+++ b/APLIKASI SIGESIT SANDAS PKM PADASUKA.docx
@@ -5846,10 +5846,7 @@
       </w:r>
       <w:proofErr w:type="spellEnd"/>
       <w:r>
-        <w:t xml:space="preserve">  </w:t>
-      </w:r>
-      <w:r>
-        <w:t>Free</w:t>
+        <w:t xml:space="preserve">  Free</w:t>
       </w:r>
       <w:proofErr w:type="gramEnd"/>
       <w:r>
@@ -5911,10 +5908,7 @@
       </w:r>
       <w:proofErr w:type="gramEnd"/>
       <w:r>
-        <w:t>F),</w:t>
-      </w:r>
-      <w:r>
-        <w:t xml:space="preserve"> = </w:t>
+        <w:t xml:space="preserve">F), = </w:t>
       </w:r>
       <w:proofErr w:type="spellStart"/>
       <w:r>
@@ -6287,6 +6281,381 @@
         <w:ind w:left="1440"/>
         <w:jc w:val="both"/>
       </w:pPr>
+    </w:p>
+    <w:p>
+      <w:pPr>
+        <w:spacing w:after="0" w:line="240" w:lineRule="auto"/>
+        <w:jc w:val="both"/>
+      </w:pPr>
+    </w:p>
+    <w:p>
+      <w:pPr>
+        <w:spacing w:after="0" w:line="240" w:lineRule="auto"/>
+        <w:jc w:val="both"/>
+      </w:pPr>
+    </w:p>
+    <w:p>
+      <w:pPr>
+        <w:pStyle w:val="ListParagraph"/>
+        <w:numPr>
+          <w:ilvl w:val="0"/>
+          <w:numId w:val="11"/>
+        </w:numPr>
+        <w:spacing w:after="0" w:line="240" w:lineRule="auto"/>
+        <w:jc w:val="both"/>
+      </w:pPr>
+      <w:r>
+        <w:t xml:space="preserve">Di </w:t>
+      </w:r>
+      <w:proofErr w:type="spellStart"/>
+      <w:r>
+        <w:t>setiap</w:t>
+      </w:r>
+      <w:proofErr w:type="spellEnd"/>
+      <w:r>
+        <w:t xml:space="preserve"> </w:t>
+      </w:r>
+      <w:proofErr w:type="spellStart"/>
+      <w:proofErr w:type="gramStart"/>
+      <w:r>
+        <w:t>modul</w:t>
+      </w:r>
+      <w:proofErr w:type="spellEnd"/>
+      <w:r>
+        <w:t xml:space="preserve">  </w:t>
+      </w:r>
+      <w:proofErr w:type="spellStart"/>
+      <w:r>
+        <w:t>untuk</w:t>
+      </w:r>
+      <w:proofErr w:type="spellEnd"/>
+      <w:proofErr w:type="gramEnd"/>
+      <w:r>
+        <w:t xml:space="preserve"> </w:t>
+      </w:r>
+      <w:proofErr w:type="spellStart"/>
+      <w:r>
+        <w:t>tombol</w:t>
+      </w:r>
+      <w:proofErr w:type="spellEnd"/>
+      <w:r>
+        <w:t xml:space="preserve"> </w:t>
+      </w:r>
+      <w:proofErr w:type="spellStart"/>
+      <w:r>
+        <w:t>simpan</w:t>
+      </w:r>
+      <w:proofErr w:type="spellEnd"/>
+      <w:r>
+        <w:t xml:space="preserve"> </w:t>
+      </w:r>
+      <w:proofErr w:type="spellStart"/>
+      <w:r>
+        <w:t>ada</w:t>
+      </w:r>
+      <w:proofErr w:type="spellEnd"/>
+      <w:r>
+        <w:t xml:space="preserve"> </w:t>
+      </w:r>
+      <w:proofErr w:type="spellStart"/>
+      <w:r>
+        <w:t>dibawah</w:t>
+      </w:r>
+      <w:proofErr w:type="spellEnd"/>
+      <w:r>
+        <w:t xml:space="preserve"> form entry dan </w:t>
+      </w:r>
+      <w:proofErr w:type="spellStart"/>
+      <w:r>
+        <w:t>ada</w:t>
+      </w:r>
+      <w:proofErr w:type="spellEnd"/>
+      <w:r>
+        <w:t xml:space="preserve"> </w:t>
+      </w:r>
+      <w:proofErr w:type="spellStart"/>
+      <w:r>
+        <w:t>tombol</w:t>
+      </w:r>
+      <w:proofErr w:type="spellEnd"/>
+      <w:r>
+        <w:t xml:space="preserve"> back </w:t>
+      </w:r>
+      <w:proofErr w:type="spellStart"/>
+      <w:r>
+        <w:t>jika</w:t>
+      </w:r>
+      <w:proofErr w:type="spellEnd"/>
+      <w:r>
+        <w:t xml:space="preserve"> user </w:t>
+      </w:r>
+      <w:proofErr w:type="spellStart"/>
+      <w:r>
+        <w:t>mau</w:t>
+      </w:r>
+      <w:proofErr w:type="spellEnd"/>
+      <w:r>
+        <w:t xml:space="preserve"> </w:t>
+      </w:r>
+      <w:proofErr w:type="spellStart"/>
+      <w:r>
+        <w:t>melihat</w:t>
+      </w:r>
+      <w:proofErr w:type="spellEnd"/>
+      <w:r>
+        <w:t xml:space="preserve"> </w:t>
+      </w:r>
+      <w:proofErr w:type="spellStart"/>
+      <w:r>
+        <w:t>hasil</w:t>
+      </w:r>
+      <w:proofErr w:type="spellEnd"/>
+      <w:r>
+        <w:t xml:space="preserve"> data entry</w:t>
+      </w:r>
+    </w:p>
+    <w:p>
+      <w:pPr>
+        <w:pStyle w:val="ListParagraph"/>
+        <w:numPr>
+          <w:ilvl w:val="0"/>
+          <w:numId w:val="11"/>
+        </w:numPr>
+        <w:spacing w:after="0" w:line="240" w:lineRule="auto"/>
+        <w:jc w:val="both"/>
+      </w:pPr>
+      <w:proofErr w:type="spellStart"/>
+      <w:r>
+        <w:t>Untuk</w:t>
+      </w:r>
+      <w:proofErr w:type="spellEnd"/>
+      <w:r>
+        <w:t xml:space="preserve"> </w:t>
+      </w:r>
+      <w:proofErr w:type="spellStart"/>
+      <w:r>
+        <w:t>modul</w:t>
+      </w:r>
+      <w:proofErr w:type="spellEnd"/>
+      <w:r>
+        <w:t xml:space="preserve"> Uji air </w:t>
+      </w:r>
+      <w:proofErr w:type="spellStart"/>
+      <w:r>
+        <w:t>untuk</w:t>
+      </w:r>
+      <w:proofErr w:type="spellEnd"/>
+      <w:r>
+        <w:t xml:space="preserve"> </w:t>
+      </w:r>
+      <w:proofErr w:type="spellStart"/>
+      <w:r>
+        <w:t>Suhu</w:t>
+      </w:r>
+      <w:proofErr w:type="spellEnd"/>
+      <w:r>
+        <w:t xml:space="preserve"> </w:t>
+      </w:r>
+      <w:proofErr w:type="spellStart"/>
+      <w:r>
+        <w:t>ada</w:t>
+      </w:r>
+      <w:proofErr w:type="spellEnd"/>
+      <w:r>
+        <w:t xml:space="preserve"> 2 </w:t>
+      </w:r>
+      <w:proofErr w:type="spellStart"/>
+      <w:r>
+        <w:t>jenis</w:t>
+      </w:r>
+      <w:proofErr w:type="spellEnd"/>
+      <w:r>
+        <w:t xml:space="preserve"> entry </w:t>
+      </w:r>
+      <w:proofErr w:type="spellStart"/>
+      <w:r>
+        <w:t>suhu</w:t>
+      </w:r>
+      <w:proofErr w:type="spellEnd"/>
+      <w:r>
+        <w:t xml:space="preserve"> </w:t>
+      </w:r>
+      <w:proofErr w:type="spellStart"/>
+      <w:r>
+        <w:t>yaitu</w:t>
+      </w:r>
+      <w:proofErr w:type="spellEnd"/>
+      <w:r>
+        <w:t xml:space="preserve"> </w:t>
+      </w:r>
+      <w:proofErr w:type="spellStart"/>
+      <w:r>
+        <w:t>Suhu</w:t>
+      </w:r>
+      <w:proofErr w:type="spellEnd"/>
+      <w:r>
+        <w:t xml:space="preserve"> Air dan </w:t>
+      </w:r>
+      <w:proofErr w:type="spellStart"/>
+      <w:r>
+        <w:t>Suhu</w:t>
+      </w:r>
+      <w:proofErr w:type="spellEnd"/>
+      <w:r>
+        <w:t xml:space="preserve"> Udara </w:t>
+      </w:r>
+    </w:p>
+    <w:p>
+      <w:pPr>
+        <w:pStyle w:val="ListParagraph"/>
+        <w:numPr>
+          <w:ilvl w:val="0"/>
+          <w:numId w:val="11"/>
+        </w:numPr>
+        <w:spacing w:after="0" w:line="240" w:lineRule="auto"/>
+        <w:jc w:val="both"/>
+      </w:pPr>
+      <w:proofErr w:type="spellStart"/>
+      <w:r>
+        <w:t>Untuk</w:t>
+      </w:r>
+      <w:proofErr w:type="spellEnd"/>
+      <w:r>
+        <w:t xml:space="preserve"> </w:t>
+      </w:r>
+      <w:proofErr w:type="spellStart"/>
+      <w:r>
+        <w:t>kolom</w:t>
+      </w:r>
+      <w:proofErr w:type="spellEnd"/>
+      <w:r>
+        <w:t xml:space="preserve"> entry di </w:t>
+      </w:r>
+      <w:proofErr w:type="spellStart"/>
+      <w:r>
+        <w:t>modul</w:t>
+      </w:r>
+      <w:proofErr w:type="spellEnd"/>
+      <w:r>
+        <w:t xml:space="preserve"> uji </w:t>
+      </w:r>
+      <w:proofErr w:type="gramStart"/>
+      <w:r>
+        <w:t xml:space="preserve">air  </w:t>
+      </w:r>
+      <w:proofErr w:type="spellStart"/>
+      <w:r>
+        <w:t>dibuat</w:t>
+      </w:r>
+      <w:proofErr w:type="spellEnd"/>
+      <w:proofErr w:type="gramEnd"/>
+      <w:r>
+        <w:t xml:space="preserve"> free </w:t>
+      </w:r>
+      <w:proofErr w:type="spellStart"/>
+      <w:proofErr w:type="gramStart"/>
+      <w:r>
+        <w:t>texr</w:t>
+      </w:r>
+      <w:proofErr w:type="spellEnd"/>
+      <w:r>
+        <w:t xml:space="preserve">  (</w:t>
+      </w:r>
+      <w:proofErr w:type="gramEnd"/>
+      <w:r>
+        <w:t xml:space="preserve"> </w:t>
+      </w:r>
+      <w:proofErr w:type="spellStart"/>
+      <w:r>
+        <w:t>tidak</w:t>
+      </w:r>
+      <w:proofErr w:type="spellEnd"/>
+      <w:r>
+        <w:t xml:space="preserve"> number </w:t>
+      </w:r>
+      <w:proofErr w:type="gramStart"/>
+      <w:r>
+        <w:t>only )</w:t>
+      </w:r>
+      <w:proofErr w:type="gramEnd"/>
+    </w:p>
+    <w:p>
+      <w:pPr>
+        <w:pStyle w:val="ListParagraph"/>
+        <w:numPr>
+          <w:ilvl w:val="0"/>
+          <w:numId w:val="11"/>
+        </w:numPr>
+        <w:spacing w:after="0" w:line="240" w:lineRule="auto"/>
+        <w:jc w:val="both"/>
+      </w:pPr>
+      <w:r>
+        <w:t xml:space="preserve">Hasil entry uji air dan uji </w:t>
+      </w:r>
+      <w:proofErr w:type="spellStart"/>
+      <w:r>
+        <w:t>udara</w:t>
+      </w:r>
+      <w:proofErr w:type="spellEnd"/>
+      <w:r>
+        <w:t xml:space="preserve"> </w:t>
+      </w:r>
+      <w:proofErr w:type="spellStart"/>
+      <w:r>
+        <w:t>harus</w:t>
+      </w:r>
+      <w:proofErr w:type="spellEnd"/>
+      <w:r>
+        <w:t xml:space="preserve"> </w:t>
+      </w:r>
+      <w:proofErr w:type="spellStart"/>
+      <w:r>
+        <w:t>sesuai</w:t>
+      </w:r>
+      <w:proofErr w:type="spellEnd"/>
+      <w:r>
+        <w:t xml:space="preserve"> </w:t>
+      </w:r>
+      <w:proofErr w:type="spellStart"/>
+      <w:r>
+        <w:t>atau</w:t>
+      </w:r>
+      <w:proofErr w:type="spellEnd"/>
+      <w:r>
+        <w:t xml:space="preserve"> </w:t>
+      </w:r>
+      <w:proofErr w:type="spellStart"/>
+      <w:r>
+        <w:t>lengkap</w:t>
+      </w:r>
+      <w:proofErr w:type="spellEnd"/>
+      <w:r>
+        <w:t xml:space="preserve"> </w:t>
+      </w:r>
+      <w:proofErr w:type="spellStart"/>
+      <w:r>
+        <w:t>sejumlah</w:t>
+      </w:r>
+      <w:proofErr w:type="spellEnd"/>
+      <w:r>
+        <w:t xml:space="preserve"> </w:t>
+      </w:r>
+      <w:proofErr w:type="spellStart"/>
+      <w:r>
+        <w:t>kolom</w:t>
+      </w:r>
+      <w:proofErr w:type="spellEnd"/>
+      <w:r>
+        <w:t xml:space="preserve"> entry </w:t>
+      </w:r>
+      <w:proofErr w:type="spellStart"/>
+      <w:r>
+        <w:t>nya</w:t>
+      </w:r>
+      <w:proofErr w:type="spellEnd"/>
+      <w:r>
+        <w:t xml:space="preserve"> </w:t>
+      </w:r>
     </w:p>
     <w:p>
       <w:pPr>
@@ -7187,6 +7556,95 @@
       </w:pPr>
     </w:lvl>
     <w:lvl w:ilvl="8" w:tplc="3809001B" w:tentative="1">
+      <w:start w:val="1"/>
+      <w:numFmt w:val="lowerRoman"/>
+      <w:lvlText w:val="%9."/>
+      <w:lvlJc w:val="right"/>
+      <w:pPr>
+        <w:ind w:left="6480" w:hanging="180"/>
+      </w:pPr>
+    </w:lvl>
+  </w:abstractNum>
+  <w:abstractNum w:abstractNumId="10" w15:restartNumberingAfterBreak="0">
+    <w:nsid w:val="7FF64F45"/>
+    <w:multiLevelType w:val="hybridMultilevel"/>
+    <w:tmpl w:val="35A8E206"/>
+    <w:lvl w:ilvl="0" w:tplc="0421000F">
+      <w:start w:val="1"/>
+      <w:numFmt w:val="decimal"/>
+      <w:lvlText w:val="%1."/>
+      <w:lvlJc w:val="left"/>
+      <w:pPr>
+        <w:ind w:left="720" w:hanging="360"/>
+      </w:pPr>
+      <w:rPr>
+        <w:rFonts w:hint="default"/>
+      </w:rPr>
+    </w:lvl>
+    <w:lvl w:ilvl="1" w:tplc="04210019" w:tentative="1">
+      <w:start w:val="1"/>
+      <w:numFmt w:val="lowerLetter"/>
+      <w:lvlText w:val="%2."/>
+      <w:lvlJc w:val="left"/>
+      <w:pPr>
+        <w:ind w:left="1440" w:hanging="360"/>
+      </w:pPr>
+    </w:lvl>
+    <w:lvl w:ilvl="2" w:tplc="0421001B" w:tentative="1">
+      <w:start w:val="1"/>
+      <w:numFmt w:val="lowerRoman"/>
+      <w:lvlText w:val="%3."/>
+      <w:lvlJc w:val="right"/>
+      <w:pPr>
+        <w:ind w:left="2160" w:hanging="180"/>
+      </w:pPr>
+    </w:lvl>
+    <w:lvl w:ilvl="3" w:tplc="0421000F" w:tentative="1">
+      <w:start w:val="1"/>
+      <w:numFmt w:val="decimal"/>
+      <w:lvlText w:val="%4."/>
+      <w:lvlJc w:val="left"/>
+      <w:pPr>
+        <w:ind w:left="2880" w:hanging="360"/>
+      </w:pPr>
+    </w:lvl>
+    <w:lvl w:ilvl="4" w:tplc="04210019" w:tentative="1">
+      <w:start w:val="1"/>
+      <w:numFmt w:val="lowerLetter"/>
+      <w:lvlText w:val="%5."/>
+      <w:lvlJc w:val="left"/>
+      <w:pPr>
+        <w:ind w:left="3600" w:hanging="360"/>
+      </w:pPr>
+    </w:lvl>
+    <w:lvl w:ilvl="5" w:tplc="0421001B" w:tentative="1">
+      <w:start w:val="1"/>
+      <w:numFmt w:val="lowerRoman"/>
+      <w:lvlText w:val="%6."/>
+      <w:lvlJc w:val="right"/>
+      <w:pPr>
+        <w:ind w:left="4320" w:hanging="180"/>
+      </w:pPr>
+    </w:lvl>
+    <w:lvl w:ilvl="6" w:tplc="0421000F" w:tentative="1">
+      <w:start w:val="1"/>
+      <w:numFmt w:val="decimal"/>
+      <w:lvlText w:val="%7."/>
+      <w:lvlJc w:val="left"/>
+      <w:pPr>
+        <w:ind w:left="5040" w:hanging="360"/>
+      </w:pPr>
+    </w:lvl>
+    <w:lvl w:ilvl="7" w:tplc="04210019" w:tentative="1">
+      <w:start w:val="1"/>
+      <w:numFmt w:val="lowerLetter"/>
+      <w:lvlText w:val="%8."/>
+      <w:lvlJc w:val="left"/>
+      <w:pPr>
+        <w:ind w:left="5760" w:hanging="360"/>
+      </w:pPr>
+    </w:lvl>
+    <w:lvl w:ilvl="8" w:tplc="0421001B" w:tentative="1">
       <w:start w:val="1"/>
       <w:numFmt w:val="lowerRoman"/>
       <w:lvlText w:val="%9."/>
@@ -7225,6 +7683,9 @@
   </w:num>
   <w:num w:numId="10" w16cid:durableId="1456214854">
     <w:abstractNumId w:val="0"/>
+  </w:num>
+  <w:num w:numId="11" w16cid:durableId="977996350">
+    <w:abstractNumId w:val="10"/>
   </w:num>
 </w:numbering>
 </file>

</xml_diff>